<commit_message>
Modèle V2 : dernier tour de langue (consignes et gloses serrées sur les formes lues)
- « tsy mbola vakina » à la place de « tsy mbola nosokajiana » ; « mahasalama ny vatana » à la place de
  « mitahiry fahasalamana ny olona … » ; « Aza sotroina ny rano maloto ! » (le mandrara du PE) dans
  l'exercice de ponctuation ; question de la Tombana raccourcie sans terme de grammaire inventé
- CARNET : +4 lignes (aza + matoanteny, mahasalama ny vatana, vakina/vakio, apetraka)
- fiche modèle régénérée : 47 001 o, 106 invariants TUATUA, --rouge 16 suivies / 0 réapparition

Co-authored-by: arena-agent <297053741+arena-agent@users.noreply.github.com>
</commit_message>
<xml_diff>
--- a/manuel-malagasy-t5/output/Manuel_Malagasy_T5_FICHE-MODELE_V2.docx
+++ b/manuel-malagasy-t5/output/Manuel_Malagasy_T5_FICHE-MODELE_V2.docx
@@ -1123,7 +1123,7 @@
           <w:color w:val="000000"/>
           <w:sz w:val="22"/>
         </w:rPr>
-        <w:t xml:space="preserve"> + matoanteny amin'ny -ina, ny torohevitra momba ny fahasalamana.</w:t>
+        <w:t xml:space="preserve"> + matoanteny amin'ny -ina, indrindra amin'ny torohevitra momba ny fahasalamana.</w:t>
       </w:r>
     </w:p>
     <w:p>
@@ -1208,7 +1208,7 @@
           <w:color w:val="000000"/>
           <w:sz w:val="22"/>
         </w:rPr>
-        <w:t xml:space="preserve"> rano avokoa. (tsy nisy ny teny « dia » nananjara ny entimilaza sy ny lazaina)</w:t>
+        <w:t xml:space="preserve"> rano avokoa. (tsy nisy ny teny « dia » ; ny entimilaza sy ny lazaina dia tsy mifandray)</w:t>
       </w:r>
     </w:p>
     <w:p>
@@ -1224,7 +1224,7 @@
           <w:color w:val="000000"/>
           <w:sz w:val="22"/>
         </w:rPr>
-        <w:t>— Diso : Ny rano dia akora iankinan'ny aina — Marina : Ny rano dia akora iankinan'ny aina. (tsy nisy teboka ny faran'ny fehezanteny)</w:t>
+        <w:t>— Diso : Ny rano dia akora iankinan'ny aina — Marina : Ny rano dia akora iankinan'ny aina. (tsy nisy teboka teo amin'ny faran'ny fehezanteny)</w:t>
       </w:r>
     </w:p>
     <w:p>
@@ -1259,7 +1259,7 @@
           <w:color w:val="000000"/>
           <w:sz w:val="22"/>
         </w:rPr>
-        <w:t>. (tsy voalaza ny zavatra kolokoloana)</w:t>
+        <w:t>. (tsy voalaza ny zavatra hikolokoloana)</w:t>
       </w:r>
     </w:p>
     <w:p>
@@ -1308,7 +1308,7 @@
           <w:color w:val="000000"/>
           <w:sz w:val="22"/>
         </w:rPr>
-        <w:t xml:space="preserve"> : ny akora ilaina mba hanana aina, toy ny sakafo mahavelona ; </w:t>
+        <w:t xml:space="preserve"> : ny zavatra ilain'ny aina mba ho velona ; </w:t>
       </w:r>
       <w:r>
         <w:rPr>
@@ -1327,7 +1327,7 @@
           <w:color w:val="000000"/>
           <w:sz w:val="22"/>
         </w:rPr>
-        <w:t xml:space="preserve"> : ny hitahiry azy ho an'ny aina ; </w:t>
+        <w:t xml:space="preserve"> : hitahiry, tsy avela hiala ; </w:t>
       </w:r>
       <w:r>
         <w:rPr>
@@ -2347,7 +2347,7 @@
           <w:color w:val="000000"/>
           <w:sz w:val="22"/>
         </w:rPr>
-        <w:t>3) Ohatra : Manan-danja be ny fanadiovana, hany ka mitahiry fahasalamana ny olona mazoto.</w:t>
+        <w:t>3) Ohatra : Manan-danja be ny fanadiovana, hany ka mahasalama ny vatana.</w:t>
       </w:r>
     </w:p>
     <w:p>
@@ -2410,7 +2410,7 @@
           <w:color w:val="000000"/>
           <w:sz w:val="22"/>
         </w:rPr>
-        <w:t>2) Ny tsy fahampian'ny rano maloto ho an'ny fahasalamana.</w:t>
+        <w:t>2) Ny rano maloto dia mety mitondra aretina.</w:t>
       </w:r>
     </w:p>
     <w:p>
@@ -2426,7 +2426,7 @@
           <w:color w:val="000000"/>
           <w:sz w:val="22"/>
         </w:rPr>
-        <w:t>3) Ny ifandraisan'ny tanana maloto sy ny aretina.</w:t>
+        <w:t>3) Ny fanasana ny tanana dia fepetra fototra ho an'ny fahasalamana.</w:t>
       </w:r>
     </w:p>
     <w:p>
@@ -2442,7 +2442,7 @@
           <w:color w:val="000000"/>
           <w:sz w:val="22"/>
         </w:rPr>
-        <w:t>4) Ny lanjan'ny rano eo amin'ny fiarahamonina.</w:t>
+        <w:t>4) Ny rano dia manana lanja eo amin'ny fiarahamonina.</w:t>
       </w:r>
     </w:p>
     <w:p>
@@ -4558,7 +4558,7 @@
                 <w:color w:val="000000"/>
                 <w:sz w:val="20"/>
               </w:rPr>
-              <w:t>Ny efa fantatra no averina eto; ny lahatsoratra dia tsy mbola nosokajiana.</w:t>
+              <w:t>Ny efa fantatra no averina eto; ny lahatsoratra vaovao dia tsy mbola vakina.</w:t>
             </w:r>
           </w:p>
         </w:tc>
@@ -4624,7 +4624,7 @@
                 <w:color w:val="000000"/>
                 <w:sz w:val="20"/>
               </w:rPr>
-              <w:t>Fanontaniana : Rehefa ny lohateny dia hoe « Ny rano, iankinan'ny aina », inona no mety ho votoatin'ny lahatsoratra ? V.A. : Misy ifandraisany ny rano sy ny fahasalamana, satria iankinan'ny aina ny rano.</w:t>
+              <w:t>Fanontaniana : Ny lohateny dia hoe « Ny rano, iankinan'ny aina » — inona no mety ho votoatin'ny lahatsoratra ? V.A. : Misy ifandraisany ny rano sy ny fahasalamana, satria iankinan'ny aina ny rano.</w:t>
             </w:r>
           </w:p>
         </w:tc>
@@ -5022,7 +5022,7 @@
                 <w:color w:val="000000"/>
                 <w:sz w:val="20"/>
               </w:rPr>
-              <w:t>2. Rano ve ny vatan'ny olombelona ?</w:t>
+              <w:t>2. Misy rano ao amin'ny vatan'ny olombelona ve ?</w:t>
             </w:r>
           </w:p>
           <w:p>
@@ -5147,7 +5147,7 @@
                 <w:color w:val="000000"/>
                 <w:sz w:val="20"/>
               </w:rPr>
-              <w:t>2. Ny 3/4 ny vatan'ny olombelona dia rano avokoa.</w:t>
+              <w:t>2. Eny, ny 3/4 ny vatan'ny olombelona dia rano avokoa.</w:t>
             </w:r>
           </w:p>
           <w:p>
@@ -5222,7 +5222,7 @@
                 <w:color w:val="000000"/>
                 <w:sz w:val="20"/>
               </w:rPr>
-              <w:t>7. Misy: ny fanasana ny tanana sy ny fisotroana rano madio dia fepetra fototra isan'andro.</w:t>
+              <w:t>7. Misy : ny fanasana ny tanana sy ny fisotroana rano madio dia fepetra fototra isan'andro.</w:t>
             </w:r>
           </w:p>
         </w:tc>
@@ -5450,7 +5450,7 @@
                 <w:color w:val="000000"/>
                 <w:sz w:val="20"/>
               </w:rPr>
-              <w:t>2) Inona no atao ny rano vao sotroina</w:t>
+              <w:t>2) Misy rano ao amin'ny vatan'ny olombelona ve</w:t>
             </w:r>
           </w:p>
           <w:p>
@@ -5466,7 +5466,7 @@
                 <w:color w:val="000000"/>
                 <w:sz w:val="20"/>
               </w:rPr>
-              <w:t>3) Mazoto ny rehetra manasa tanana alohan'ny mihinana</w:t>
+              <w:t>3) Aza sotroina ny rano maloto</w:t>
             </w:r>
           </w:p>
           <w:p>
@@ -5482,7 +5482,7 @@
                 <w:color w:val="000000"/>
                 <w:sz w:val="20"/>
               </w:rPr>
-              <w:t>4) Rano ve ny vatan'ny olombelona</w:t>
+              <w:t>4) Firy amin'ny vatan'ny olombelona no rano</w:t>
             </w:r>
           </w:p>
           <w:p>
@@ -5893,7 +5893,7 @@
                 <w:color w:val="000000"/>
                 <w:sz w:val="20"/>
               </w:rPr>
-              <w:t>4. Inona no mari-piatoana faran'ny fehezanteny filazana ?</w:t>
+              <w:t>4. Inona no mari-piatoana amin'ny faran'ny fehezanteny voalohany amin'ny lahatsoratra ?</w:t>
             </w:r>
           </w:p>
         </w:tc>

</xml_diff>

<commit_message>
Modèle V2 : audit automatisé de chaque mot de la fiche contre le corpus local
Contrôle neuf : les 1 270 tokens de la fiche sont comparés au vocabulaire réellement écrit dans le corpus
(PE + les deux pages collées). Quatre mots sans trace ont sauté — « natsangana » (remplacé par « apetraka
voalohany »), « ny maha-iankinan'ny aina » (on cite la phrase, pas une nominalisation inventée),
« mpamboly » (le PE et la page disent « tompon'ny tanimbary »), « nosokajiana » (« vakina »). Reste 45
formes sans trace exacte, toutes dues à la découpe sur l'apostrophe ou à des mots de base du malgache
(tabilao, banga, mangatsiaka, mafana, …) : liste à soumettre au relecteur, pas à corriger à l'aveugle.

Co-authored-by: arena-agent <297053741+arena-agent@users.noreply.github.com>
</commit_message>
<xml_diff>
--- a/manuel-malagasy-t5/output/Manuel_Malagasy_T5_FICHE-MODELE_V2.docx
+++ b/manuel-malagasy-t5/output/Manuel_Malagasy_T5_FICHE-MODELE_V2.docx
@@ -1088,7 +1088,7 @@
           <w:color w:val="000000"/>
           <w:sz w:val="22"/>
         </w:rPr>
-        <w:t xml:space="preserve"> (mivadi-drafitra), ilay lazaina no natsangana.</w:t>
+        <w:t xml:space="preserve"> (mivadi-drafitra) : ny lazaina no apetraka voalohany.</w:t>
       </w:r>
     </w:p>
     <w:p>
@@ -2394,7 +2394,7 @@
           <w:color w:val="000000"/>
           <w:sz w:val="22"/>
         </w:rPr>
-        <w:t>1) Ny maha-iankinan'ny aina ny rano.</w:t>
+        <w:t>1) Ny rano dia akora iankinan'ny aina.</w:t>
       </w:r>
     </w:p>
     <w:p>
@@ -5561,7 +5561,7 @@
                 <w:color w:val="000000"/>
                 <w:sz w:val="20"/>
               </w:rPr>
-              <w:t>4) Eny an-tanimbary dia mahay mifanaraka foana amin'ny ………… ny mpamboly.</w:t>
+              <w:t>4) Eny an-tanimbary dia mahay mifanaraka foana amin'ny ………… ny tompon'ny tanimbary.</w:t>
             </w:r>
           </w:p>
         </w:tc>
@@ -5848,7 +5848,7 @@
                 <w:color w:val="000000"/>
                 <w:sz w:val="20"/>
               </w:rPr>
-              <w:t>1. Inona no lohatenin'ny lahatsoratra nosokajiana ?</w:t>
+              <w:t>1. Inona no lohatenin'ny lahatsoratra vakina ?</w:t>
             </w:r>
           </w:p>
           <w:p>

</xml_diff>